<commit_message>
fix: Embed official UNIROW logo and optimize 1-page layout for PDF export
</commit_message>
<xml_diff>
--- a/assets/Template_UTS_UNIROW.docx
+++ b/assets/Template_UTS_UNIROW.docx
@@ -32,7 +32,7 @@
             <wp:positionV relativeFrom="page">
               <wp:posOffset>720000</wp:posOffset>
             </wp:positionV>
-            <wp:extent cx="889000" cy="901700"/>
+            <wp:extent cx="889000" cy="906780"/>
             <wp:effectExtent l="0" t="0" r="0" b="0"/>
             <wp:wrapNone/>
             <wp:docPr id="2" name="image1.png"/>
@@ -54,7 +54,7 @@
                   <pic:spPr>
                     <a:xfrm>
                       <a:off x="0" y="0"/>
-                      <a:ext cx="889000" cy="901700"/>
+                      <a:ext cx="889000" cy="906780"/>
                     </a:xfrm>
                     <a:prstGeom prst="rect">
                       <a:avLst/>
@@ -1082,7 +1082,7 @@
     </w:p>
     <w:sectPr>
       <w:pgSz w:w="11906" w:h="16838"/>
-      <w:pgMar w:top="1133" w:right="1440" w:bottom="1440" w:left="1440" w:header="708" w:footer="708" w:gutter="0"/>
+      <w:pgMar w:top="950" w:right="1200" w:bottom="950" w:left="1200" w:header="708" w:footer="708" w:gutter="0"/>
       <w:pgNumType w:start="1"/>
       <w:cols w:space="720"/>
     </w:sectPr>

</xml_diff>